<commit_message>
feat: align SODIF cybersecurity product and assurance evidence
</commit_message>
<xml_diff>
--- a/docs/SODIF_Security_Operational_Report.docx
+++ b/docs/SODIF_Security_Operational_Report.docx
@@ -18,7 +18,7 @@
           <w:color w:val="087F8C"/>
           <w:sz w:val="18"/>
         </w:rPr>
-        <w:t>SIGNED INTENT CONTROL</w:t>
+        <w:t>CYBERSECURITY EXECUTION CONTROL</w:t>
       </w:r>
     </w:p>
     <w:p>
@@ -47,7 +47,7 @@
           <w:color w:val="607086"/>
           <w:sz w:val="24"/>
         </w:rPr>
-        <w:t>Raport Document-to-API pentru execuția controlată a unei comenzi de achiziție</w:t>
+        <w:t>Validarea lanțului de securitate de la revizia semnată la efectul API</w:t>
       </w:r>
     </w:p>
     <w:p>
@@ -91,7 +91,7 @@
           <w:color w:val="0B2545"/>
           <w:sz w:val="20"/>
         </w:rPr>
-        <w:t>SODIF Transaction Control</w:t>
+        <w:t>SODIF Operations</w:t>
       </w:r>
     </w:p>
     <w:p>
@@ -157,7 +157,7 @@
           <w:color w:val="0B2545"/>
           <w:sz w:val="20"/>
         </w:rPr>
-        <w:t>flight-cb6417c2f3f3290a</w:t>
+        <w:t>flight-9af392efb33ff47d</w:t>
       </w:r>
     </w:p>
     <w:p>
@@ -215,7 +215,7 @@
           <w:color w:val="0B2545"/>
           <w:sz w:val="20"/>
         </w:rPr>
-        <w:t xml:space="preserve">Domeniu: </w:t>
+        <w:t xml:space="preserve">Acoperire: </w:t>
       </w:r>
       <w:r>
         <w:rPr>
@@ -223,7 +223,7 @@
           <w:color w:val="0B2545"/>
           <w:sz w:val="20"/>
         </w:rPr>
-        <w:t>Comandă semnată / API operațional</w:t>
+        <w:t>SODIF Security / API controlat</w:t>
       </w:r>
     </w:p>
     <w:p>
@@ -250,6 +250,28 @@
     </w:p>
     <w:p>
       <w:pPr>
+        <w:spacing w:after="40"/>
+      </w:pPr>
+      <w:r>
+        <w:rPr>
+          <w:rFonts w:ascii="Calibri" w:hAnsi="Calibri" w:eastAsia="Calibri"/>
+          <w:b/>
+          <w:color w:val="0B2545"/>
+          <w:sz w:val="20"/>
+        </w:rPr>
+        <w:t xml:space="preserve">Versiune: </w:t>
+      </w:r>
+      <w:r>
+        <w:rPr>
+          <w:rFonts w:ascii="Calibri" w:hAnsi="Calibri" w:eastAsia="Calibri"/>
+          <w:color w:val="0B2545"/>
+          <w:sz w:val="20"/>
+        </w:rPr>
+        <w:t>0.20.0</w:t>
+      </w:r>
+    </w:p>
+    <w:p>
+      <w:pPr>
         <w:spacing w:after="80"/>
       </w:pPr>
     </w:p>
@@ -282,6 +304,418 @@
         <w:t>Acțiunile conforme au fost autorizate, iar modificările, ambiguitățile și reutilizările au fost oprite înainte de sistemul operațional.</w:t>
       </w:r>
     </w:p>
+    <w:p>
+      <w:pPr>
+        <w:pStyle w:val="Heading1"/>
+      </w:pPr>
+      <w:r>
+        <w:t>Configurația validată în laborator</w:t>
+      </w:r>
+    </w:p>
+    <w:p>
+      <w:pPr>
+        <w:keepNext/>
+      </w:pPr>
+      <w:r>
+        <w:t>Rularea exercită implementarea modulară Python prin date controlate, chei de test și un serviciu API local. Rezultatele sunt reproductibile și corelate cu artefactele exportate.</w:t>
+      </w:r>
+    </w:p>
+    <w:tbl>
+      <w:tblPr>
+        <w:tblStyle w:val="TableGrid"/>
+        <w:tblW w:type="dxa" w:w="9360"/>
+        <w:tblLayout w:type="fixed"/>
+        <w:tblLook w:firstColumn="1" w:firstRow="1" w:lastColumn="0" w:lastRow="0" w:noHBand="0" w:noVBand="1" w:val="04A0"/>
+        <w:tblInd w:w="120" w:type="dxa"/>
+      </w:tblPr>
+      <w:tblGrid>
+        <w:gridCol w:w="2450"/>
+        <w:gridCol w:w="6910"/>
+      </w:tblGrid>
+      <w:tr>
+        <w:trPr>
+          <w:tblHeader w:val="true"/>
+        </w:trPr>
+        <w:tc>
+          <w:tcPr>
+            <w:tcW w:type="dxa" w:w="2450"/>
+            <w:vAlign w:val="center"/>
+            <w:tcMar>
+              <w:top w:w="80" w:type="dxa"/>
+              <w:bottom w:w="80" w:type="dxa"/>
+              <w:start w:w="120" w:type="dxa"/>
+              <w:end w:w="120" w:type="dxa"/>
+            </w:tcMar>
+            <w:shd w:fill="F2F4F7"/>
+          </w:tcPr>
+          <w:p>
+            <w:pPr>
+              <w:spacing w:before="0" w:after="0" w:line="252" w:lineRule="auto"/>
+            </w:pPr>
+            <w:r>
+              <w:rPr>
+                <w:rFonts w:ascii="Calibri" w:hAnsi="Calibri" w:eastAsia="Calibri"/>
+                <w:b/>
+                <w:color w:val="0B2545"/>
+                <w:sz w:val="18"/>
+              </w:rPr>
+              <w:t>Componentă</w:t>
+            </w:r>
+          </w:p>
+        </w:tc>
+        <w:tc>
+          <w:tcPr>
+            <w:tcW w:type="dxa" w:w="6910"/>
+            <w:vAlign w:val="center"/>
+            <w:tcMar>
+              <w:top w:w="80" w:type="dxa"/>
+              <w:bottom w:w="80" w:type="dxa"/>
+              <w:start w:w="120" w:type="dxa"/>
+              <w:end w:w="120" w:type="dxa"/>
+            </w:tcMar>
+            <w:shd w:fill="F2F4F7"/>
+          </w:tcPr>
+          <w:p>
+            <w:pPr>
+              <w:spacing w:before="0" w:after="0" w:line="252" w:lineRule="auto"/>
+            </w:pPr>
+            <w:r>
+              <w:rPr>
+                <w:rFonts w:ascii="Calibri" w:hAnsi="Calibri" w:eastAsia="Calibri"/>
+                <w:b/>
+                <w:color w:val="0B2545"/>
+                <w:sz w:val="18"/>
+              </w:rPr>
+              <w:t>Implementare validată</w:t>
+            </w:r>
+          </w:p>
+        </w:tc>
+      </w:tr>
+      <w:tr>
+        <w:tc>
+          <w:tcPr>
+            <w:tcW w:type="dxa" w:w="2450"/>
+            <w:vAlign w:val="center"/>
+            <w:tcMar>
+              <w:top w:w="80" w:type="dxa"/>
+              <w:bottom w:w="80" w:type="dxa"/>
+              <w:start w:w="120" w:type="dxa"/>
+              <w:end w:w="120" w:type="dxa"/>
+            </w:tcMar>
+          </w:tcPr>
+          <w:p>
+            <w:pPr>
+              <w:spacing w:before="0" w:after="0" w:line="252" w:lineRule="auto"/>
+            </w:pPr>
+            <w:r>
+              <w:rPr>
+                <w:rFonts w:ascii="Calibri" w:hAnsi="Calibri" w:eastAsia="Calibri"/>
+                <w:b/>
+                <w:color w:val="0B2545"/>
+                <w:sz w:val="18"/>
+              </w:rPr>
+              <w:t>Revizie semnată</w:t>
+            </w:r>
+          </w:p>
+        </w:tc>
+        <w:tc>
+          <w:tcPr>
+            <w:tcW w:type="dxa" w:w="6910"/>
+            <w:vAlign w:val="center"/>
+            <w:tcMar>
+              <w:top w:w="80" w:type="dxa"/>
+              <w:bottom w:w="80" w:type="dxa"/>
+              <w:start w:w="120" w:type="dxa"/>
+              <w:end w:w="120" w:type="dxa"/>
+            </w:tcMar>
+          </w:tcPr>
+          <w:p>
+            <w:pPr>
+              <w:spacing w:before="0" w:after="0" w:line="252" w:lineRule="auto"/>
+            </w:pPr>
+            <w:r>
+              <w:rPr>
+                <w:rFonts w:ascii="Calibri" w:hAnsi="Calibri" w:eastAsia="Calibri"/>
+                <w:b w:val="0"/>
+                <w:color w:val="0B2545"/>
+                <w:sz w:val="18"/>
+              </w:rPr>
+              <w:t>Semnătură Ed25519 detașată peste metadate canonice și digestul SHA-256 al conținutului.</w:t>
+            </w:r>
+          </w:p>
+        </w:tc>
+      </w:tr>
+      <w:tr>
+        <w:tc>
+          <w:tcPr>
+            <w:tcW w:type="dxa" w:w="2450"/>
+            <w:vAlign w:val="center"/>
+            <w:tcMar>
+              <w:top w:w="80" w:type="dxa"/>
+              <w:bottom w:w="80" w:type="dxa"/>
+              <w:start w:w="120" w:type="dxa"/>
+              <w:end w:w="120" w:type="dxa"/>
+            </w:tcMar>
+          </w:tcPr>
+          <w:p>
+            <w:pPr>
+              <w:spacing w:before="0" w:after="0" w:line="252" w:lineRule="auto"/>
+            </w:pPr>
+            <w:r>
+              <w:rPr>
+                <w:rFonts w:ascii="Calibri" w:hAnsi="Calibri" w:eastAsia="Calibri"/>
+                <w:b/>
+                <w:color w:val="0B2545"/>
+                <w:sz w:val="18"/>
+              </w:rPr>
+              <w:t>Reprezentări și consens</w:t>
+            </w:r>
+          </w:p>
+        </w:tc>
+        <w:tc>
+          <w:tcPr>
+            <w:tcW w:type="dxa" w:w="6910"/>
+            <w:vAlign w:val="center"/>
+            <w:tcMar>
+              <w:top w:w="80" w:type="dxa"/>
+              <w:bottom w:w="80" w:type="dxa"/>
+              <w:start w:w="120" w:type="dxa"/>
+              <w:end w:w="120" w:type="dxa"/>
+            </w:tcMar>
+          </w:tcPr>
+          <w:p>
+            <w:pPr>
+              <w:spacing w:before="0" w:after="0" w:line="252" w:lineRule="auto"/>
+            </w:pPr>
+            <w:r>
+              <w:rPr>
+                <w:rFonts w:ascii="Calibri" w:hAnsi="Calibri" w:eastAsia="Calibri"/>
+                <w:b w:val="0"/>
+                <w:color w:val="0B2545"/>
+                <w:sz w:val="18"/>
+              </w:rPr>
+              <w:t>Reprezentări independente controlate, normalizare tipizată și consens determinist la nivel de câmp.</w:t>
+            </w:r>
+          </w:p>
+        </w:tc>
+      </w:tr>
+      <w:tr>
+        <w:tc>
+          <w:tcPr>
+            <w:tcW w:type="dxa" w:w="2450"/>
+            <w:vAlign w:val="center"/>
+            <w:tcMar>
+              <w:top w:w="80" w:type="dxa"/>
+              <w:bottom w:w="80" w:type="dxa"/>
+              <w:start w:w="120" w:type="dxa"/>
+              <w:end w:w="120" w:type="dxa"/>
+            </w:tcMar>
+          </w:tcPr>
+          <w:p>
+            <w:pPr>
+              <w:spacing w:before="0" w:after="0" w:line="252" w:lineRule="auto"/>
+            </w:pPr>
+            <w:r>
+              <w:rPr>
+                <w:rFonts w:ascii="Calibri" w:hAnsi="Calibri" w:eastAsia="Calibri"/>
+                <w:b/>
+                <w:color w:val="0B2545"/>
+                <w:sz w:val="18"/>
+              </w:rPr>
+              <w:t>Verificare adaptivă</w:t>
+            </w:r>
+          </w:p>
+        </w:tc>
+        <w:tc>
+          <w:tcPr>
+            <w:tcW w:type="dxa" w:w="6910"/>
+            <w:vAlign w:val="center"/>
+            <w:tcMar>
+              <w:top w:w="80" w:type="dxa"/>
+              <w:bottom w:w="80" w:type="dxa"/>
+              <w:start w:w="120" w:type="dxa"/>
+              <w:end w:w="120" w:type="dxa"/>
+            </w:tcMar>
+          </w:tcPr>
+          <w:p>
+            <w:pPr>
+              <w:spacing w:before="0" w:after="0" w:line="252" w:lineRule="auto"/>
+            </w:pPr>
+            <w:r>
+              <w:rPr>
+                <w:rFonts w:ascii="Calibri" w:hAnsi="Calibri" w:eastAsia="Calibri"/>
+                <w:b w:val="0"/>
+                <w:color w:val="0B2545"/>
+                <w:sz w:val="18"/>
+              </w:rPr>
+              <w:t>Niveluri V0-V3 selectate în funcție de risc, completitudinea valorilor și divergențele cu efect operațional.</w:t>
+            </w:r>
+          </w:p>
+        </w:tc>
+      </w:tr>
+      <w:tr>
+        <w:tc>
+          <w:tcPr>
+            <w:tcW w:type="dxa" w:w="2450"/>
+            <w:vAlign w:val="center"/>
+            <w:tcMar>
+              <w:top w:w="80" w:type="dxa"/>
+              <w:bottom w:w="80" w:type="dxa"/>
+              <w:start w:w="120" w:type="dxa"/>
+              <w:end w:w="120" w:type="dxa"/>
+            </w:tcMar>
+          </w:tcPr>
+          <w:p>
+            <w:pPr>
+              <w:spacing w:before="0" w:after="0" w:line="252" w:lineRule="auto"/>
+            </w:pPr>
+            <w:r>
+              <w:rPr>
+                <w:rFonts w:ascii="Calibri" w:hAnsi="Calibri" w:eastAsia="Calibri"/>
+                <w:b/>
+                <w:color w:val="0B2545"/>
+                <w:sz w:val="18"/>
+              </w:rPr>
+              <w:t>Permis de execuție</w:t>
+            </w:r>
+          </w:p>
+        </w:tc>
+        <w:tc>
+          <w:tcPr>
+            <w:tcW w:type="dxa" w:w="6910"/>
+            <w:vAlign w:val="center"/>
+            <w:tcMar>
+              <w:top w:w="80" w:type="dxa"/>
+              <w:bottom w:w="80" w:type="dxa"/>
+              <w:start w:w="120" w:type="dxa"/>
+              <w:end w:w="120" w:type="dxa"/>
+            </w:tcMar>
+          </w:tcPr>
+          <w:p>
+            <w:pPr>
+              <w:spacing w:before="0" w:after="0" w:line="252" w:lineRule="auto"/>
+            </w:pPr>
+            <w:r>
+              <w:rPr>
+                <w:rFonts w:ascii="Calibri" w:hAnsi="Calibri" w:eastAsia="Calibri"/>
+                <w:b w:val="0"/>
+                <w:color w:val="0B2545"/>
+                <w:sz w:val="18"/>
+              </w:rPr>
+              <w:t>Permis Ed25519 cu utilizare unică, legat de metodă, rută, parametri, destinație și termen de valabilitate.</w:t>
+            </w:r>
+          </w:p>
+        </w:tc>
+      </w:tr>
+      <w:tr>
+        <w:tc>
+          <w:tcPr>
+            <w:tcW w:type="dxa" w:w="2450"/>
+            <w:vAlign w:val="center"/>
+            <w:tcMar>
+              <w:top w:w="80" w:type="dxa"/>
+              <w:bottom w:w="80" w:type="dxa"/>
+              <w:start w:w="120" w:type="dxa"/>
+              <w:end w:w="120" w:type="dxa"/>
+            </w:tcMar>
+          </w:tcPr>
+          <w:p>
+            <w:pPr>
+              <w:spacing w:before="0" w:after="0" w:line="252" w:lineRule="auto"/>
+            </w:pPr>
+            <w:r>
+              <w:rPr>
+                <w:rFonts w:ascii="Calibri" w:hAnsi="Calibri" w:eastAsia="Calibri"/>
+                <w:b/>
+                <w:color w:val="0B2545"/>
+                <w:sz w:val="18"/>
+              </w:rPr>
+              <w:t>Control API</w:t>
+            </w:r>
+          </w:p>
+        </w:tc>
+        <w:tc>
+          <w:tcPr>
+            <w:tcW w:type="dxa" w:w="6910"/>
+            <w:vAlign w:val="center"/>
+            <w:tcMar>
+              <w:top w:w="80" w:type="dxa"/>
+              <w:bottom w:w="80" w:type="dxa"/>
+              <w:start w:w="120" w:type="dxa"/>
+              <w:end w:w="120" w:type="dxa"/>
+            </w:tcMar>
+          </w:tcPr>
+          <w:p>
+            <w:pPr>
+              <w:spacing w:before="0" w:after="0" w:line="252" w:lineRule="auto"/>
+            </w:pPr>
+            <w:r>
+              <w:rPr>
+                <w:rFonts w:ascii="Calibri" w:hAnsi="Calibri" w:eastAsia="Calibri"/>
+                <w:b w:val="0"/>
+                <w:color w:val="0B2545"/>
+                <w:sz w:val="18"/>
+              </w:rPr>
+              <w:t>Politică locală pentru ruta POST protejată, recanonicalizarea cererii și blocarea reutilizării permisului.</w:t>
+            </w:r>
+          </w:p>
+        </w:tc>
+      </w:tr>
+      <w:tr>
+        <w:tc>
+          <w:tcPr>
+            <w:tcW w:type="dxa" w:w="2450"/>
+            <w:vAlign w:val="center"/>
+            <w:tcMar>
+              <w:top w:w="80" w:type="dxa"/>
+              <w:bottom w:w="80" w:type="dxa"/>
+              <w:start w:w="120" w:type="dxa"/>
+              <w:end w:w="120" w:type="dxa"/>
+            </w:tcMar>
+          </w:tcPr>
+          <w:p>
+            <w:pPr>
+              <w:spacing w:before="0" w:after="0" w:line="252" w:lineRule="auto"/>
+            </w:pPr>
+            <w:r>
+              <w:rPr>
+                <w:rFonts w:ascii="Calibri" w:hAnsi="Calibri" w:eastAsia="Calibri"/>
+                <w:b/>
+                <w:color w:val="0B2545"/>
+                <w:sz w:val="18"/>
+              </w:rPr>
+              <w:t>Audit</w:t>
+            </w:r>
+          </w:p>
+        </w:tc>
+        <w:tc>
+          <w:tcPr>
+            <w:tcW w:type="dxa" w:w="6910"/>
+            <w:vAlign w:val="center"/>
+            <w:tcMar>
+              <w:top w:w="80" w:type="dxa"/>
+              <w:bottom w:w="80" w:type="dxa"/>
+              <w:start w:w="120" w:type="dxa"/>
+              <w:end w:w="120" w:type="dxa"/>
+            </w:tcMar>
+          </w:tcPr>
+          <w:p>
+            <w:pPr>
+              <w:spacing w:before="0" w:after="0" w:line="252" w:lineRule="auto"/>
+            </w:pPr>
+            <w:r>
+              <w:rPr>
+                <w:rFonts w:ascii="Calibri" w:hAnsi="Calibri" w:eastAsia="Calibri"/>
+                <w:b w:val="0"/>
+                <w:color w:val="0B2545"/>
+                <w:sz w:val="18"/>
+              </w:rPr>
+              <w:t>Raport DOCX, date JSON, jurnal NDJSON, manifest SHA-256, pachet ZIP și registru criptografic al rulărilor.</w:t>
+            </w:r>
+          </w:p>
+        </w:tc>
+      </w:tr>
+    </w:tbl>
     <w:p>
       <w:pPr>
         <w:pStyle w:val="Heading1"/>
@@ -2782,7 +3216,7 @@
         <w:color w:val="607086"/>
         <w:sz w:val="16"/>
       </w:rPr>
-      <w:t xml:space="preserve">flight-cb6417c2f3f3290a  |  Page </w:t>
+      <w:t xml:space="preserve">flight-9af392efb33ff47d  |  Page </w:t>
     </w:r>
     <w:r>
       <w:rPr>
@@ -2815,7 +3249,7 @@
         <w:color w:val="607086"/>
         <w:sz w:val="16"/>
       </w:rPr>
-      <w:t>SODIF  |  CONTROL TRANZACȚIONAL</w:t>
+      <w:t>SODIF  |  SECURITATEA EXECUȚIEI</w:t>
     </w:r>
   </w:p>
 </w:hdr>

</xml_diff>

<commit_message>
Standardize product identity and refresh evidence
</commit_message>
<xml_diff>
--- a/docs/SODIF_Security_Operational_Report.docx
+++ b/docs/SODIF_Security_Operational_Report.docx
@@ -69,7 +69,7 @@
           <w:color w:val="0B2545"/>
           <w:sz w:val="20"/>
         </w:rPr>
-        <w:t>TECHSUITE</w:t>
+        <w:t>TECHSUITE SRL</w:t>
       </w:r>
     </w:p>
     <w:p>
@@ -157,7 +157,7 @@
           <w:color w:val="0B2545"/>
           <w:sz w:val="20"/>
         </w:rPr>
-        <w:t>flight-9af392efb33ff47d</w:t>
+        <w:t>flight-04e3a68ca122b0e4</w:t>
       </w:r>
     </w:p>
     <w:p>
@@ -3216,7 +3216,7 @@
         <w:color w:val="607086"/>
         <w:sz w:val="16"/>
       </w:rPr>
-      <w:t xml:space="preserve">flight-9af392efb33ff47d  |  Page </w:t>
+      <w:t xml:space="preserve">flight-04e3a68ca122b0e4  |  Page </w:t>
     </w:r>
     <w:r>
       <w:rPr>

</xml_diff>